<commit_message>
Credit note: fix invoice date spacing, totals, and gross reconciliation
- split_template_date: space after comma; normalize_date_comma_spacing for display
- Template: Amount after discount line with {{ total_ship }}
- Reconcile gross_display vs gross_eur when they diverge (>5% use larger total)
- Stronger UI extract prompt for full invoice total and matching gross_eur

Made-with: Cursor
</commit_message>
<xml_diff>
--- a/templates/template new.docx
+++ b/templates/template new.docx
@@ -451,6 +451,47 @@
           <w:lang w:val="en-US"/>
         </w:rPr>
         <w:t xml:space="preserve"> discount</w:t>
+      </w:r>
+    </w:p>
+    <w:p>
+      <w:pPr>
+        <w:ind w:firstLine="851"/>
+        <w:rPr>
+          <w:lang w:val="en-US"/>
+        </w:rPr>
+      </w:pPr>
+      <w:r>
+        <w:rPr>
+          <w:lang w:val="en-US"/>
+        </w:rPr>
+        <w:t xml:space="preserve">Amount after discount is</w:t>
+      </w:r>
+      <w:r>
+        <w:rPr>
+          <w:lang w:val="en-US"/>
+        </w:rPr>
+        <w:t xml:space="preserve"> -</w:t>
+      </w:r>
+      <w:r>
+        <w:rPr>
+          <w:lang w:val="en-US"/>
+        </w:rPr>
+        <w:tab/>
+        <w:t xml:space="preserve">                                                                         </w:t>
+      </w:r>
+      <w:r>
+        <w:rPr>
+          <w:b/>
+          <w:bCs/>
+          <w:lang w:val="en-US"/>
+        </w:rPr>
+        <w:t>{{ total_ship }}</w:t>
+      </w:r>
+      <w:r>
+        <w:rPr>
+          <w:lang w:val="en-US"/>
+        </w:rPr>
+        <w:tab/>
       </w:r>
     </w:p>
     <w:p>

</xml_diff>

<commit_message>
Credit note: invoice-based dates, computed discount EUR, template fallback
- resolve_ui_credit_note_date: use PDF invoice date before today default
- Legacy Gemini: infer date from inv1 fragments; stricter prompts (no today)
- discount_eur_total: always total_before_discount × site discount %
- Single-invoice: inv1_discount_eur matches computed discount
- Word template: Jinja discount_eur_total or inv1_discount_eur

Made-with: Cursor
</commit_message>
<xml_diff>
--- a/templates/template new.docx
+++ b/templates/template new.docx
@@ -2,7 +2,7 @@
 <file path=word/document.xml><?xml version="1.0" encoding="utf-8"?>
 <w:document xmlns:wpc="http://schemas.microsoft.com/office/word/2010/wordprocessingCanvas" xmlns:cx="http://schemas.microsoft.com/office/drawing/2014/chartex" xmlns:cx1="http://schemas.microsoft.com/office/drawing/2015/9/8/chartex" xmlns:cx2="http://schemas.microsoft.com/office/drawing/2015/10/21/chartex" xmlns:cx3="http://schemas.microsoft.com/office/drawing/2016/5/9/chartex" xmlns:cx4="http://schemas.microsoft.com/office/drawing/2016/5/10/chartex" xmlns:cx5="http://schemas.microsoft.com/office/drawing/2016/5/11/chartex" xmlns:cx6="http://schemas.microsoft.com/office/drawing/2016/5/12/chartex" xmlns:cx7="http://schemas.microsoft.com/office/drawing/2016/5/13/chartex" xmlns:cx8="http://schemas.microsoft.com/office/drawing/2016/5/14/chartex" xmlns:mc="http://schemas.openxmlformats.org/markup-compatibility/2006" xmlns:aink="http://schemas.microsoft.com/office/drawing/2016/ink" xmlns:am3d="http://schemas.microsoft.com/office/drawing/2017/model3d" xmlns:o="urn:schemas-microsoft-com:office:office" xmlns:oel="http://schemas.microsoft.com/office/2019/extlst" xmlns:r="http://schemas.openxmlformats.org/officeDocument/2006/relationships" xmlns:m="http://schemas.openxmlformats.org/officeDocument/2006/math" xmlns:v="urn:schemas-microsoft-com:vml" xmlns:wp14="http://schemas.microsoft.com/office/word/2010/wordprocessingDrawing" xmlns:wp="http://schemas.openxmlformats.org/drawingml/2006/wordprocessingDrawing" xmlns:w10="urn:schemas-microsoft-com:office:word" xmlns:w="http://schemas.openxmlformats.org/wordprocessingml/2006/main" xmlns:w14="http://schemas.microsoft.com/office/word/2010/wordml" xmlns:w15="http://schemas.microsoft.com/office/word/2012/wordml" xmlns:w16cex="http://schemas.microsoft.com/office/word/2018/wordml/cex" xmlns:w16cid="http://schemas.microsoft.com/office/word/2016/wordml/cid" xmlns:w16="http://schemas.microsoft.com/office/word/2018/wordml" xmlns:w16du="http://schemas.microsoft.com/office/word/2023/wordml/word16du" xmlns:w16sdtdh="http://schemas.microsoft.com/office/word/2020/wordml/sdtdatahash" xmlns:w16sdtfl="http://schemas.microsoft.com/office/word/2024/wordml/sdtformatlock" xmlns:w16se="http://schemas.microsoft.com/office/word/2015/wordml/symex" xmlns:wpg="http://schemas.microsoft.com/office/word/2010/wordprocessingGroup" xmlns:wpi="http://schemas.microsoft.com/office/word/2010/wordprocessingInk" xmlns:wne="http://schemas.microsoft.com/office/word/2006/wordml" xmlns:wps="http://schemas.microsoft.com/office/word/2010/wordprocessingShape" mc:Ignorable="w14 w15 w16se w16cid w16 w16cex w16sdtdh w16sdtfl w16du wp14">
   <w:background w:color="FFFFFF">
-    <v:background id="_x0000_s2049" o:targetscreensize="800,600">
+    <v:background id="_x0000_s1025" o:targetscreensize="1024,768">
       <v:fill r:id="rId3" o:title="" color2="black" type="frame"/>
     </v:background>
   </w:background>
@@ -290,95 +290,96 @@
         <w:rPr>
           <w:b/>
         </w:rPr>
-        <w:t>{{ inv1_invoice_number }}</w:t>
+        <w:t xml:space="preserve">{{ inv1_invoice_number }} of </w:t>
       </w:r>
       <w:r>
         <w:rPr>
           <w:b/>
         </w:rPr>
-        <w:t xml:space="preserve"> of </w:t>
+        <w:t>{{ inv1_invoice_date }}</w:t>
+      </w:r>
+      <w:r>
+        <w:t xml:space="preserve">  </w:t>
       </w:r>
       <w:r>
         <w:rPr>
           <w:b/>
         </w:rPr>
-        <w:t>{{ inv1_invoice_date }}</w:t>
-      </w:r>
-      <w:r>
-        <w:t xml:space="preserve">  </w:t>
+        <w:t xml:space="preserve">–                         </w:t>
       </w:r>
       <w:r>
         <w:rPr>
           <w:b/>
         </w:rPr>
-        <w:t xml:space="preserve">–                         </w:t>
-      </w:r>
-      <w:r>
-        <w:rPr>
-          <w:b/>
-        </w:rPr>
         <w:tab/>
-        <w:t xml:space="preserve">          </w:t>
-      </w:r>
-      <w:r>
-        <w:rPr>
-          <w:b/>
+        <w:t xml:space="preserve">       </w:t>
+      </w:r>
+      <w:r>
+        <w:rPr>
+          <w:bCs/>
+        </w:rPr>
+        <w:t>{{ inv1_gross }}</w:t>
+      </w:r>
+    </w:p>
+    <w:p/>
+    <w:p>
+      <w:pPr>
+        <w:rPr>
+          <w:u w:val="single"/>
+        </w:rPr>
+      </w:pPr>
+    </w:p>
+    <w:p>
+      <w:pPr>
+        <w:rPr>
+          <w:u w:val="single"/>
+          <w:lang w:val="en-US"/>
+        </w:rPr>
+      </w:pPr>
+    </w:p>
+    <w:p>
+      <w:pPr>
+        <w:ind w:firstLine="851"/>
+        <w:rPr>
+          <w:lang w:val="en-US"/>
+        </w:rPr>
+      </w:pPr>
+      <w:r>
+        <w:rPr>
+          <w:lang w:val="en-US"/>
+        </w:rPr>
+        <w:t xml:space="preserve">Total </w:t>
+      </w:r>
+      <w:r>
+        <w:rPr>
+          <w:lang w:val="en-US"/>
+        </w:rPr>
+        <w:t>gross amount is</w:t>
+      </w:r>
+      <w:r>
+        <w:rPr>
+          <w:lang w:val="en-US"/>
+        </w:rPr>
+        <w:t xml:space="preserve"> -</w:t>
+      </w:r>
+      <w:r>
+        <w:rPr>
+          <w:lang w:val="en-US"/>
         </w:rPr>
         <w:tab/>
-        <w:t xml:space="preserve">  </w:t>
-      </w:r>
-      <w:r>
-        <w:rPr>
-          <w:b/>
-        </w:rPr>
-        <w:t xml:space="preserve"> </w:t>
-      </w:r>
-      <w:r>
-        <w:rPr>
-          <w:bCs/>
-        </w:rPr>
-        <w:t xml:space="preserve">      </w:t>
-      </w:r>
-      <w:r>
-        <w:rPr>
-          <w:bCs/>
-        </w:rPr>
-        <w:t xml:space="preserve"> </w:t>
-      </w:r>
-      <w:r>
-        <w:rPr>
-          <w:bCs/>
-        </w:rPr>
-        <w:t xml:space="preserve">  </w:t>
-      </w:r>
-      <w:r>
-        <w:rPr>
-          <w:bCs/>
-        </w:rPr>
-        <w:t xml:space="preserve"> </w:t>
-      </w:r>
-      <w:r>
-        <w:rPr>
-          <w:bCs/>
-        </w:rPr>
-        <w:t>{{ inv1_gross }}</w:t>
-      </w:r>
-    </w:p>
-    <w:p/>
-    <w:p>
-      <w:pPr>
-        <w:rPr>
-          <w:u w:val="single"/>
-        </w:rPr>
-      </w:pPr>
-    </w:p>
-    <w:p>
-      <w:pPr>
-        <w:rPr>
-          <w:u w:val="single"/>
-          <w:lang w:val="en-US"/>
-        </w:rPr>
-      </w:pPr>
+      </w:r>
+      <w:r>
+        <w:rPr>
+          <w:lang w:val="en-US"/>
+        </w:rPr>
+        <w:t xml:space="preserve">                                                                         {{ total_gross }}</w:t>
+      </w:r>
+      <w:r>
+        <w:rPr>
+          <w:lang w:val="en-US"/>
+        </w:rPr>
+        <w:tab/>
+      </w:r>
     </w:p>
     <w:p>
       <w:pPr>
@@ -391,40 +392,19 @@
         <w:rPr>
           <w:lang w:val="en-US"/>
         </w:rPr>
-        <w:t xml:space="preserve">Total </w:t>
-      </w:r>
-      <w:r>
-        <w:rPr>
-          <w:lang w:val="en-US"/>
-        </w:rPr>
-        <w:t>gross amount is</w:t>
-      </w:r>
-      <w:r>
-        <w:rPr>
-          <w:lang w:val="en-US"/>
-        </w:rPr>
-        <w:t xml:space="preserve"> -</w:t>
-      </w:r>
-      <w:r>
-        <w:rPr>
-          <w:lang w:val="en-US"/>
-        </w:rPr>
-        <w:tab/>
-        <w:t xml:space="preserve">                                                                         </w:t>
-      </w:r>
-      <w:r>
-        <w:rPr>
-          <w:b/>
-          <w:bCs/>
-          <w:lang w:val="en-US"/>
-        </w:rPr>
-        <w:t>{{ total_gross }}</w:t>
-      </w:r>
-      <w:r>
-        <w:rPr>
-          <w:lang w:val="en-US"/>
-        </w:rPr>
-        <w:tab/>
+        <w:t>Deducting {{ inv1_discount_pct }}% discount</w:t>
+      </w:r>
+      <w:r>
+        <w:rPr>
+          <w:lang w:val="en-US"/>
+        </w:rPr>
+        <w:t xml:space="preserve">                                         </w:t>
+      </w:r>
+      <w:r>
+        <w:rPr>
+          <w:lang w:val="en-US"/>
+        </w:rPr>
+        <w:t>{{ discount_eur_total or inv1_discount_eur }}</w:t>
       </w:r>
     </w:p>
     <w:p>
@@ -438,33 +418,7 @@
         <w:rPr>
           <w:lang w:val="en-US"/>
         </w:rPr>
-        <w:t xml:space="preserve">Deducting </w:t>
-      </w:r>
-      <w:r>
-        <w:rPr>
-          <w:lang w:val="en-US"/>
-        </w:rPr>
-        <w:t>{{ inv1_discount_pct }}%</w:t>
-      </w:r>
-      <w:r>
-        <w:rPr>
-          <w:lang w:val="en-US"/>
-        </w:rPr>
-        <w:t xml:space="preserve"> discount</w:t>
-      </w:r>
-    </w:p>
-    <w:p>
-      <w:pPr>
-        <w:ind w:firstLine="851"/>
-        <w:rPr>
-          <w:lang w:val="en-US"/>
-        </w:rPr>
-      </w:pPr>
-      <w:r>
-        <w:rPr>
-          <w:lang w:val="en-US"/>
-        </w:rPr>
-        <w:t xml:space="preserve">Amount after discount is</w:t>
+        <w:t>Total net amount for payment is</w:t>
       </w:r>
       <w:r>
         <w:rPr>
@@ -887,6 +841,7 @@
     <w:lvl w:ilvl="0">
       <w:start w:val="1"/>
       <w:numFmt w:val="none"/>
+      <w:pStyle w:val="Heading1"/>
       <w:suff w:val="nothing"/>
       <w:lvlText w:val=""/>
       <w:lvlJc w:val="left"/>
@@ -991,6 +946,7 @@
     <w:lvl w:ilvl="8">
       <w:start w:val="1"/>
       <w:numFmt w:val="none"/>
+      <w:pStyle w:val="Heading9"/>
       <w:suff w:val="nothing"/>
       <w:lvlText w:val=""/>
       <w:lvlJc w:val="left"/>
@@ -1633,6 +1589,50 @@
     <w:lsdException w:name="Subtitle" w:qFormat="1"/>
     <w:lsdException w:name="Strong" w:qFormat="1"/>
     <w:lsdException w:name="Emphasis" w:qFormat="1"/>
+    <w:lsdException w:name="Normal Table" w:semiHidden="1" w:unhideWhenUsed="1"/>
+    <w:lsdException w:name="Table Simple 1" w:semiHidden="1" w:unhideWhenUsed="1"/>
+    <w:lsdException w:name="Table Simple 2" w:semiHidden="1" w:unhideWhenUsed="1"/>
+    <w:lsdException w:name="Table Simple 3" w:semiHidden="1" w:unhideWhenUsed="1"/>
+    <w:lsdException w:name="Table Classic 1" w:semiHidden="1" w:unhideWhenUsed="1"/>
+    <w:lsdException w:name="Table Classic 2" w:semiHidden="1" w:unhideWhenUsed="1"/>
+    <w:lsdException w:name="Table Classic 3" w:semiHidden="1" w:unhideWhenUsed="1"/>
+    <w:lsdException w:name="Table Classic 4" w:semiHidden="1" w:unhideWhenUsed="1"/>
+    <w:lsdException w:name="Table Colorful 1" w:semiHidden="1" w:unhideWhenUsed="1"/>
+    <w:lsdException w:name="Table Colorful 2" w:semiHidden="1" w:unhideWhenUsed="1"/>
+    <w:lsdException w:name="Table Colorful 3" w:semiHidden="1" w:unhideWhenUsed="1"/>
+    <w:lsdException w:name="Table Columns 1" w:semiHidden="1" w:unhideWhenUsed="1"/>
+    <w:lsdException w:name="Table Columns 2" w:semiHidden="1" w:unhideWhenUsed="1"/>
+    <w:lsdException w:name="Table Columns 3" w:semiHidden="1" w:unhideWhenUsed="1"/>
+    <w:lsdException w:name="Table Columns 4" w:semiHidden="1" w:unhideWhenUsed="1"/>
+    <w:lsdException w:name="Table Columns 5" w:semiHidden="1" w:unhideWhenUsed="1"/>
+    <w:lsdException w:name="Table Grid 1" w:semiHidden="1" w:unhideWhenUsed="1"/>
+    <w:lsdException w:name="Table Grid 2" w:semiHidden="1" w:unhideWhenUsed="1"/>
+    <w:lsdException w:name="Table Grid 3" w:semiHidden="1" w:unhideWhenUsed="1"/>
+    <w:lsdException w:name="Table Grid 4" w:semiHidden="1" w:unhideWhenUsed="1"/>
+    <w:lsdException w:name="Table Grid 5" w:semiHidden="1" w:unhideWhenUsed="1"/>
+    <w:lsdException w:name="Table Grid 6" w:semiHidden="1" w:unhideWhenUsed="1"/>
+    <w:lsdException w:name="Table Grid 7" w:semiHidden="1" w:unhideWhenUsed="1"/>
+    <w:lsdException w:name="Table Grid 8" w:semiHidden="1" w:unhideWhenUsed="1"/>
+    <w:lsdException w:name="Table List 1" w:semiHidden="1" w:unhideWhenUsed="1"/>
+    <w:lsdException w:name="Table List 2" w:semiHidden="1" w:unhideWhenUsed="1"/>
+    <w:lsdException w:name="Table List 3" w:semiHidden="1" w:unhideWhenUsed="1"/>
+    <w:lsdException w:name="Table List 4" w:semiHidden="1" w:unhideWhenUsed="1"/>
+    <w:lsdException w:name="Table List 5" w:semiHidden="1" w:unhideWhenUsed="1"/>
+    <w:lsdException w:name="Table List 6" w:semiHidden="1" w:unhideWhenUsed="1"/>
+    <w:lsdException w:name="Table List 7" w:semiHidden="1" w:unhideWhenUsed="1"/>
+    <w:lsdException w:name="Table List 8" w:semiHidden="1" w:unhideWhenUsed="1"/>
+    <w:lsdException w:name="Table 3D effects 1" w:semiHidden="1" w:unhideWhenUsed="1"/>
+    <w:lsdException w:name="Table 3D effects 2" w:semiHidden="1" w:unhideWhenUsed="1"/>
+    <w:lsdException w:name="Table 3D effects 3" w:semiHidden="1" w:unhideWhenUsed="1"/>
+    <w:lsdException w:name="Table Contemporary" w:semiHidden="1" w:unhideWhenUsed="1"/>
+    <w:lsdException w:name="Table Elegant" w:semiHidden="1" w:unhideWhenUsed="1"/>
+    <w:lsdException w:name="Table Professional" w:semiHidden="1" w:unhideWhenUsed="1"/>
+    <w:lsdException w:name="Table Subtle 1" w:semiHidden="1" w:unhideWhenUsed="1"/>
+    <w:lsdException w:name="Table Subtle 2" w:semiHidden="1" w:unhideWhenUsed="1"/>
+    <w:lsdException w:name="Table Web 1" w:semiHidden="1" w:unhideWhenUsed="1"/>
+    <w:lsdException w:name="Table Web 2" w:semiHidden="1" w:unhideWhenUsed="1"/>
+    <w:lsdException w:name="Table Web 3" w:semiHidden="1" w:unhideWhenUsed="1"/>
+    <w:lsdException w:name="Table Theme" w:semiHidden="1" w:unhideWhenUsed="1"/>
     <w:lsdException w:name="Placeholder Text" w:semiHidden="1" w:uiPriority="99"/>
     <w:lsdException w:name="No Spacing" w:uiPriority="1" w:qFormat="1"/>
     <w:lsdException w:name="Light Shading" w:uiPriority="60"/>
@@ -1907,11 +1907,15 @@
   </w:style>
   <w:style w:type="character" w:default="1" w:styleId="DefaultParagraphFont">
     <w:name w:val="Default Paragraph Font"/>
+    <w:uiPriority w:val="1"/>
     <w:semiHidden/>
+    <w:unhideWhenUsed/>
   </w:style>
   <w:style w:type="table" w:default="1" w:styleId="TableNormal">
     <w:name w:val="Normal Table"/>
+    <w:uiPriority w:val="99"/>
     <w:semiHidden/>
+    <w:unhideWhenUsed/>
     <w:tblPr>
       <w:tblInd w:w="0" w:type="dxa"/>
       <w:tblCellMar>
@@ -1924,7 +1928,9 @@
   </w:style>
   <w:style w:type="numbering" w:default="1" w:styleId="NoList">
     <w:name w:val="No List"/>
+    <w:uiPriority w:val="99"/>
     <w:semiHidden/>
+    <w:unhideWhenUsed/>
   </w:style>
   <w:style w:type="character" w:customStyle="1" w:styleId="WW8Num1z0">
     <w:name w:val="WW8Num1z0"/>
@@ -1952,9 +1958,6 @@
   </w:style>
   <w:style w:type="character" w:customStyle="1" w:styleId="WW8Num1z8">
     <w:name w:val="WW8Num1z8"/>
-  </w:style>
-  <w:style w:type="character" w:styleId="DefaultParagraphFont0">
-    <w:name w:val="Default Paragraph Font"/>
   </w:style>
   <w:style w:type="character" w:customStyle="1" w:styleId="WW8Num2z0">
     <w:name w:val="WW8Num2z0"/>
@@ -1992,7 +1995,7 @@
   </w:style>
   <w:style w:type="character" w:styleId="PageNumber">
     <w:name w:val="page number"/>
-    <w:basedOn w:val="DefaultParagraphFont0"/>
+    <w:basedOn w:val="DefaultParagraphFont"/>
   </w:style>
   <w:style w:type="paragraph" w:customStyle="1" w:styleId="Heading">
     <w:name w:val="Heading"/>

</xml_diff>